<commit_message>
Replace English appendix with complete translation of Chinese original
</commit_message>
<xml_diff>
--- a/舞台剧本_2.docx
+++ b/舞台剧本_2.docx
@@ -36,277 +36,31 @@
         <w:pageBreakBefore/>
       </w:pPr>
       <w:r>
-        <w:t>附录 英文原文</w:t>
-      </w:r>
-    </w:p>
-    <w:p>
-      <w:pPr>
-        <w:pStyle w:val="Heading1"/>
-      </w:pPr>
-      <w:r>
-        <w:t>I</w:t>
+        <w:t>附录 中文原文的完整英文翻译</w:t>
       </w:r>
     </w:p>
     <w:p>
       <w:pPr/>
       <w:r>
-        <w:t>She was still drawing when, one day, a voice rose inside her—sacred, and impossibly clear. She could not say what the voice was. But whenever she heard it, she could sit by the window and stare at the tree outside for an entire day.</w:t>
+        <w:t>The inspiration I am talking about is this: the girl had always felt very lost, but throughout high school, before her final year, she had worked very, very hard to get into a good university. Then she got into Renmin University, and she thought it was wonderful. She studied finance, but after she began studying finance, she discovered that everyone else competed even harder than she did and performed even better. And everyone seemed possessed by the need to get to the next step. But she just felt that Renmin was already very good. She felt that the university had already given her what she wanted: that feeling of seeing how vast the world was. So she fell into a state of confusion, until one day she had a sudden idea, or perhaps saw some advertisement or something in a newspaper. She had not imagined that in 2026, in an age like 2025 and 2026 when AI was everywhere, she could still see something like this drift before her eyes: someone had quit their job and started out on the path to becoming a doctor. And she began to wonder: if I dropped out of here, dropped out in my second year, and went back to my first year of high school to study again, and then chose to become a doctor, what kind of life would that be? Because she was so lost and in so much pain. At university, she had lain in bed, caught in such extreme anxiety that she could not get up. She had also seen the abyss, looked out of the window, and wanted to jump. A life without a goal driving her forward felt very, very unfamiliar. But she had made it through all that time because there was something very, very beautiful in her mind: far away, her family and friends were thinking of her. But she also knew that one day she would have to face the world alone, because she knew: I need to start solving a great many problems on my own as soon as possible. Perhaps I was born to be alone. And it was in this situation that she decided, with her eyes closed—she even closed her eyes and blindly clicked a button—to drop out, to drop out and go back to the first year of high school to be, to study all over again, to repeat those years and take the exams to become a doctor. Then, after getting into a medical program, she went to Zhongshan Medical University. At Zhongshan Medical University she was very, very tired. Every day she had to share a cramped dormitory with six or seven other people. They all got along well, but there were shifts, and choosing a supervisor, and everything was exhausting. Yet beneath all of this, she might have had a firmer goal: I am going to become a doctor, and I also have something that could be called a meaning in life, which is to help other people. But along the way, she discovered that her body had not even made it through the first five years before her hands began to shake. This shaking kept her from becoming a doctor. By then, she had aged and quite some time had passed, but over that long stretch of time she had learned one thing: a person can live many times, and all ages are a kind of illusion. As her experiences changed and the objective conditions of her body changed, she became aware that these objective changes existed, yet also coexisted with life in a subtle way. So once again she pressed the restart button on her life and went back to the first year of high school to prepare for the university entrance exam. This time around, she was still as full of determination as before, because the entrance exam was the only thing she needed to think about. There were no tuition fees, either, and she also gained many, many friends. She began to feel that taking the exam again was a way of redeeming her former self, the self who had no dreams. But this time, as she prepared for the exam, she would come to realize that this was life itself. This life surrounded by friendship, classrooms, and voices, a life with routine in particular, and also pressure, was dreamlike, was a—especially after she had experienced so much of a doctor's life, that state of sudden emergencies, returning to the order of a school campus and a life with a sense of purpose made her ecstatic. She knew that the pressure of the exam papers in front of her might feel smaller to her than before, but with the gaokao, the university entrance exam, ahead of her, it was still great. This pressure that was both small and great made her perspective blur. Of course, the girl still studied very hard. Where did she end up getting in? Did she choose a life that followed the rules?</w:t>
       </w:r>
     </w:p>
     <w:p>
       <w:pPr/>
       <w:r>
-        <w:t>So she watched the tree for seven days. She did nothing else. She stayed in her room and watched it.</w:t>
+        <w:t>Whether in finance or in medicine, she always did everything she could to push herself to be the best. It was the same with the gaokao. She was adapting to this perfectionist part of herself. Then one day, there was a very, very strong voice inside her, and she saw it: as though watching a revolving lantern of memories, she saw herself as a child, drawing and then dancing. But with both drawing and dancing, after she enrolled in classes and was subjected to a whole system of evaluation, her perfectionism began to collapse, making her give up both of them. Until one day she saw a painting full of saturated color, and she began to pick up a brush and paint freely, haphazardly, painting her own lines and patterns. And just like that, she painted five hundred pictures, a thousand, ten thousand. She laid out those ten thousand pictures at a market simply to display them. All of this happened that summer, the summer after the gaokao was over. While running her stall, she met an old woman. The old woman had just come back from buying vegetables, and on her shopping bag was a very beautiful, large red flower. This large red flower looked almost exactly like a large flower in one of the girl's paintings. Then they both looked at each other in great surprise. One of them—or rather, the girl in this story, this “I”—was actually already nearly thirty or forty. All the people running stalls around her were young, because this was a market organized by a university together with a high school. And she was also very surprised: why would an old woman selling vegetables pass through here? But just like that, they became images of each other. Then the old woman said, “Oh, this bunch of scallions of mine really sold quite well today.” She set down a daffodil. “I don't know why the stallholder would sell them like this.” Then the little girl said, “Yes, that's quite interesting. When I was little, I often thought daffodils were scallions. But scallions smell so good. Just having them at home makes the place feel full of life.” The old woman said, “Yes, that also makes me think of when I was very young, that bunch of scallions and the daffodil. I even wanted to stir-fry them together and see how they tasted. When you're little, you have so many strange ideas like that. But one day I came upon a big tree. Under the big tree, suddenly, there were so many grasses and scallions, and all kinds of white flowers. Only then did I realize that the daffodil might be their symbiotic companion.” Then I listened, a little dazed. This “I” in the story did not know why the old woman had suddenly thought of a story like that. Then the old woman said, “Our connection has already grown. Shall I give you these scallions? Could you give me that flower?” And I agreed. From that moment on, my ten thousand paintings became nine thousand nine hundred and ninety-nine. Among those nine thousand nine hundred and ninety-nine paintings, I kept looking at it. Saturated colors surrounded me, along with that incongruous bunch of scallions. Even the paper itself carried a trace of their smell. I held the scallions, gathered up all the paintings I had left, and took them home. I looked out of the window. The windows were lit up, many people were having parties, and the autumn wind was rustling. But I did not know what I should do, so I spread all my things out on a black table. Then I lay down in bed, wrapped up my feet, covered my icy feet to warm them, and fell into a dream. In the dream, I saw a huge cliff, and there was floodwater and the sea pouring in. I could not swim, but I watched my father, who could not swim either, jump straight down and board a train. No matter how I called out to him, he paid no attention. He left just like that. Then a woman suddenly came out of the mist and said, “Here.” She took out several steel rods and said, “Don't cry. Take care of yourself.” Then she took her own little girl by the hand and left. I had never seen that woman before, but in the dream, the look in her eyes, all her expressions and gestures, were so, so clear and distinct. Her beauty, her eyes. I had never seen this person in real life. But there we were, meeting each other in a dream. Could she have been having a dream like this too? Then I went on creating, painting many pictures in highly saturated colors. There were trees, eyes, and many objects with a sense of spirit about them. Little by little, I also forgot that I was actually someone who had already gained admission twice through the entrance exam. My life became one painting after another, connecting to each other. Once I finished one today, I would start the next. When I had no inspiration, I would make a single mark on the paper and begin to color it in. And the days went by like that, stacking up sheet by sheet, painting by painting. What do you think—what kind of future is this story hoping to hold out for?</w:t>
       </w:r>
     </w:p>
     <w:p>
       <w:pPr/>
       <w:r>
-        <w:t>She had once been someone who filled every hour of her day, from six in the morning until midnight, sometimes until one. She moved back and forth between panic, accomplishment, achievement, and pain. Along the way, she won many competitions. But when she reached university, what she achieved no longer seemed equal to the effort she put in, and something in her gave way.</w:t>
+        <w:t>Then one day, while the girl was still painting, a voice suddenly appeared in her mind, sacred, even incomparably clear. She could not say what the voice was, but whenever she heard it, she could stare at the tree outside her window in a daze for a whole day. Just like that, she watched the tree for seven days, doing nothing, sitting in her room and watching the tree. She had once been someone who had to fill her schedule from six in the morning until midnight, even one in the morning, someone tossed back and forth between panic, completion, achievement, and pain. Along the way, she had achieved a great deal in competitions, yet at university what she accomplished had not been in proportion to her effort. And she had become very, very discouraged. She began to be afraid even to imagine very large goals in the worldly sense, because she was always complaining about the past, or rather, she had a past that had never been answered. Why, when I even gave my mind and body to a dream, has the dream still not arrived? Isn't there supposed to be manifestation? I did everything I possibly could. Why didn't I get it? She had once fallen into such deep resentment, until one day she decided to bring this energy of resentment crashing out—like, how should I put it, like a tightly clenched fist—and smash it into her paintings. She struck out so many, so many of those emotions from the past, giving them colors, giving them identities, giving them spaces of their own, as though each were an independent person, a life. She was still in her room, keeping watch over this world. The desk before her grew unfamiliar. She suddenly realized that she even had three phones, but had never felt how extraordinary having three phones was. She realized that, sitting in this room, she had everything around her: a very warm bed and blankets, the cold temperature but comfortable air, some paintings, and a few snacks and ingredients. She had once turned everything she encountered into an explanation, a cause and effect that would pave the way for the future. She had worked so hard to find out what those dream images appearing in her life wanted her to do in relation to them. She had dreamed of relatives who had died, of love that had never been spoken, of that old woman, and of her mother and father arguing. A whole series of nightmares, and beautiful dreams too, were all so, so vivid. She tried to find an answer at the level of her conscious mind, but she could not wait one into being. Not being able to find it left her caught in a desire for the courage and awareness to act only after knowing the answer first. Until this day, after she had spent seven days watching the tree outside her window, she suddenly felt her body growing warm, slightly hot, as though something had suddenly arisen from a place she had never known. Why does my body have this potential, the capacity to let me stay quietly for so, so long?</w:t>
       </w:r>
     </w:p>
     <w:p>
       <w:pPr/>
       <w:r>
-        <w:t>She became afraid to imagine grand ambitions by the world’s standards. She kept returning to the past, to a question it had never answered: Why did I give my mind and body to a dream, only for that dream never to arrive? Isn’t that what manifestation is supposed to mean? I did everything I could. Why didn’t I get it?</w:t>
-      </w:r>
-    </w:p>
-    <w:p>
-      <w:pPr/>
-      <w:r>
-        <w:t>For a long time, she lived with that grievance. Then one day, she decided to bring it down onto her paintings like a tightly clenched fist. She struck the page with all the emotions she had carried from the past. She gave them colors, identities, and spaces of their own, as though each were a separate person, a separate life.</w:t>
-      </w:r>
-    </w:p>
-    <w:p>
-      <w:pPr/>
-      <w:r>
-        <w:t>She remained in her room, keeping watch over the world. The desk before her began to look unfamiliar. She suddenly realized that she owned three phones, yet had never really felt how extraordinary it was to have three phones. Sitting there, she had everything around her: a warm bed and blankets, the cold outside and the comfortable air inside, her paintings, a few snacks, and some ingredients for a meal.</w:t>
-      </w:r>
-    </w:p>
-    <w:p>
-      <w:pPr/>
-      <w:r>
-        <w:t>She used to explain every encounter as something that would pave the way for her future, part of some chain of cause and effect. She had tried so hard to find out what the images in her dreams were asking her to do. She had dreamed of relatives who had died, of love left unspoken, of the old woman, of her parents arguing. Nightmares and beautiful dreams alike were so, so vivid. She searched her conscious mind for an answer, but none came.</w:t>
-      </w:r>
-    </w:p>
-    <w:p>
-      <w:pPr/>
-      <w:r>
-        <w:t>Waiting for it left her unable to act. She wanted to know the answer first, before she dared to move.</w:t>
-      </w:r>
-    </w:p>
-    <w:p>
-      <w:pPr/>
-      <w:r>
-        <w:t>Then, after seven days of watching the tree, she suddenly felt warmth rising through her body, a slight heat coming from somewhere she had never known was there.</w:t>
-      </w:r>
-    </w:p>
-    <w:p>
-      <w:pPr/>
-      <w:r>
-        <w:t>How can my body hold this possibility? How can it let me stay quietly in one place for so very long?</w:t>
-      </w:r>
-    </w:p>
-    <w:p>
-      <w:pPr>
-        <w:pStyle w:val="Heading1"/>
-      </w:pPr>
-      <w:r>
-        <w:t>II</w:t>
-      </w:r>
-    </w:p>
-    <w:p>
-      <w:pPr/>
-      <w:r>
-        <w:t>She still longed for an answer. Her favorite answer to life had always come from Siddhartha. Siddhartha had not followed a conventional path to enlightenment through meditation alone. He had lived through rises and falls, freedom, and even darker things—desire, lust, and sensual pleasure. He grew sick of it all, almost to the point of nausea, before returning to an answer he had found for himself.</w:t>
-      </w:r>
-    </w:p>
-    <w:p>
-      <w:pPr/>
-      <w:r>
-        <w:t>She had always taken nourishment from Hesse’s writing and from the way he lived. It helped her tell herself that a person might have to pass through life’s rises and falls before encountering hope. Perhaps her own life had to be lived through in the same way before she could arrive at something.</w:t>
-      </w:r>
-    </w:p>
-    <w:p>
-      <w:pPr/>
-      <w:r>
-        <w:t>But now, after meditating, pausing, and stopping, she no longer seemed willing to believe in Siddhartha’s path. Or perhaps she no longer wanted to accept anyone else’s answer. She did not want stories from the outside to persuade the answer forming inside her.</w:t>
-      </w:r>
-    </w:p>
-    <w:p>
-      <w:pPr/>
-      <w:r>
-        <w:t>A stand-up comic might tell a story about quitting a job, spending ten years without work, and still ending up on the stage of a comedy show. Hesse, too, had ultimately returned to peace. Everything seemed to lead toward a positive, peaceful ending. The girl was tired of that kind of story.</w:t>
-      </w:r>
-    </w:p>
-    <w:p>
-      <w:pPr/>
-      <w:r>
-        <w:t>By now, she was nearly forty or fifty. By society’s measure, she ought to have been panicking. She was not.</w:t>
-      </w:r>
-    </w:p>
-    <w:p>
-      <w:pPr/>
-      <w:r>
-        <w:t>A fish drifted past her, bright with every color of the rainbow. Then more rainbow-colored fish appeared, until they formed a whole school. She saw an exquisitely colored feather settle gently onto a pine branch. Countless other feathers gathered there, becoming one enormous formation, and began to turn like a carousel.</w:t>
-      </w:r>
-    </w:p>
-    <w:p>
-      <w:pPr/>
-      <w:r>
-        <w:t>The girl began to float with them. She had no idea how any of it was happening.</w:t>
-      </w:r>
-    </w:p>
-    <w:p>
-      <w:pPr/>
-      <w:r>
-        <w:t>She floated beside the tree and saw that it was covered in eyes—thousands upon thousands of them—radiating light. A soft blue glow wrapped itself around her. She had no idea what was happening. At last she came to rest in the crown of the tree.</w:t>
-      </w:r>
-    </w:p>
-    <w:p>
-      <w:pPr/>
-      <w:r>
-        <w:t>It was the sago palm she had watched her grandfather plant when she was little. It had flowered again and again, until her family moved away, until her grandfather died, until the tree was gone. Yet here she was, sitting in it, looking up at the sky, at the largest cloud of all.</w:t>
-      </w:r>
-    </w:p>
-    <w:p>
-      <w:pPr/>
-      <w:r>
-        <w:t>She watched it for a long time.</w:t>
-      </w:r>
-    </w:p>
-    <w:p>
-      <w:pPr/>
-      <w:r>
-        <w:t>She saw the buildings of the world begin to melt into color and run into the river. The little squares of apps on her phone flowed out of the screen, turned into scents and colors, and joined the river too.</w:t>
-      </w:r>
-    </w:p>
-    <w:p>
-      <w:pPr/>
-      <w:r>
-        <w:t>Now she was sixty years old. But in truth, she was only twenty.</w:t>
-      </w:r>
-    </w:p>
-    <w:p>
-      <w:pPr/>
-      <w:r>
-        <w:t>And this was twenty.</w:t>
-      </w:r>
-    </w:p>
-    <w:p>
-      <w:pPr>
-        <w:pStyle w:val="Heading1"/>
-      </w:pPr>
-      <w:r>
-        <w:t>III</w:t>
-      </w:r>
-    </w:p>
-    <w:p>
-      <w:pPr/>
-      <w:r>
-        <w:t>All along, whether she worked in finance or medicine, she had pushed herself as far as she could, trying to be the best. She had done the same when preparing for the college entrance exam. She had learned to live with that perfectionist part of herself.</w:t>
-      </w:r>
-    </w:p>
-    <w:p>
-      <w:pPr/>
-      <w:r>
-        <w:t>Then one day, a voice rose inside her with such force that she saw her childhood pass before her like a montage: herself drawing, herself dancing. She had taken classes in both, but after being subjected to one system of evaluation after another, her perfectionism began to collapse under the weight of it. She gave them both up.</w:t>
-      </w:r>
-    </w:p>
-    <w:p>
-      <w:pPr/>
-      <w:r>
-        <w:t>Until one day, she saw a painting full of saturated color. She picked up a brush and began to paint freely, following the lines her hand made. She painted five hundred pictures, then a thousand, then ten thousand. That summer after the college entrance exam, she brought them to a market simply to put them on display.</w:t>
-      </w:r>
-    </w:p>
-    <w:p>
-      <w:pPr/>
-      <w:r>
-        <w:t>At the market, she met an old woman who had just come back from buying vegetables. On the woman’s shopping bag was a large, beautiful red flower. It looked almost exactly like a large flower in one of the girl’s paintings. They stared at each other in surprise.</w:t>
-      </w:r>
-    </w:p>
-    <w:p>
-      <w:pPr/>
-      <w:r>
-        <w:t>The girl—I, in this story—was already nearly thirty or forty. Everyone around me at the stalls was young; the market was organized jointly by a university and a high school. I was surprised to see an old woman carrying groceries through it. Yet somehow, there we were, reflected in each other.</w:t>
-      </w:r>
-    </w:p>
-    <w:p>
-      <w:pPr/>
-      <w:r>
-        <w:t>“Well,” the old woman said, “I got these scallions at a good price today.” She set down a daffodil. “I don’t know why the seller was selling them like this.”</w:t>
-      </w:r>
-    </w:p>
-    <w:p>
-      <w:pPr/>
-      <w:r>
-        <w:t>“That’s funny,” I said. “When I was little, I often thought daffodils were scallions. Scallions smell so good, though. Having a bunch at home gives the place a bit of life.”</w:t>
-      </w:r>
-    </w:p>
-    <w:p>
-      <w:pPr/>
-      <w:r>
-        <w:t>“Yes,” she said. “You’ve reminded me of when I was very young. I once wanted to fry scallions and daffodils together, just to see how they would taste. Children have so many strange ideas. Then one day, I came upon a great tree. Beneath it were grasses, scallions, and all kinds of white flowers. That was when I thought perhaps the daffodil was something that lived among them all.”</w:t>
-      </w:r>
-    </w:p>
-    <w:p>
-      <w:pPr/>
-      <w:r>
-        <w:t>I listened, a little dazed. I did not know why she had suddenly remembered this story.</w:t>
-      </w:r>
-    </w:p>
-    <w:p>
-      <w:pPr/>
-      <w:r>
-        <w:t>Then she said, “We seem to have met for a reason. How about I give you these scallions, and you give me that flower?”</w:t>
-      </w:r>
-    </w:p>
-    <w:p>
-      <w:pPr/>
-      <w:r>
-        <w:t>I agreed.</w:t>
-      </w:r>
-    </w:p>
-    <w:p>
-      <w:pPr/>
-      <w:r>
-        <w:t>From then on, my ten thousand paintings became nine thousand nine hundred and ninety-nine. The saturated colors still surrounded me, but now there was also that incongruous bunch of scallions. Even the paper seemed to carry a trace of their smell.</w:t>
-      </w:r>
-    </w:p>
-    <w:p>
-      <w:pPr/>
-      <w:r>
-        <w:t>I gathered the scallions and all my remaining paintings and took them home. I looked out the window. Lights glowed in the windows across the way; many people were having parties. The autumn wind rustled outside. I did not know what to do next, so I spread everything across a black table. Then I lay down in bed, tucked up my cold feet, and fell asleep.</w:t>
-      </w:r>
-    </w:p>
-    <w:p>
-      <w:pPr/>
-      <w:r>
-        <w:t>In my dream, I saw an enormous cliff, floodwater, and the sea swallowing everything. I could not swim. My father could not swim either, but he jumped straight in and boarded a train. I called out to him again and again. He did not answer. He left.</w:t>
-      </w:r>
-    </w:p>
-    <w:p>
-      <w:pPr/>
-      <w:r>
-        <w:t>Then a woman came out of the mist. “Here,” she said, holding out several steel rods. “Don’t cry. Take care of yourself.”</w:t>
-      </w:r>
-    </w:p>
-    <w:p>
-      <w:pPr/>
-      <w:r>
-        <w:t>She took her little girl by the hand and walked away. I had never seen the woman in waking life, yet in the dream, her eyes, her expression, every movement she made were so clear. I could see her beauty and her eyes. I had never met her in the real world, but there, in the dream, we met. Could she have been having the same dream?</w:t>
-      </w:r>
-    </w:p>
-    <w:p>
-      <w:pPr/>
-      <w:r>
-        <w:t>After that, I kept creating. I painted many pictures in saturated colors. There were trees and eyes and all sorts of beings that seemed to have spirits of their own. Little by little, I forgot that I had already taken the college entrance exam twice.</w:t>
-      </w:r>
-    </w:p>
-    <w:p>
-      <w:pPr/>
-      <w:r>
-        <w:t>My life became one painting after another, each connected to the next. When I finished one today, I painted another tomorrow. When I had no inspiration, I drew a single line on the paper and began to fill it with color. Day after day passed, one sheet laid over another.</w:t>
+        <w:t>He still longed for an answer. His favorite answer to life came from Siddhartha. Siddhartha had not taken a conventional Buddhist path of sitting in meditation; he had not reached enlightenment through meditation, but had experienced life's rises and falls, freedom and wandering, and even some shadowy shades within it, as well as greed and sexuality. But he grew tired of everything, wanted to vomit, and then returned to an answer he had set for himself, an answer he wanted. He had always taken all of Hesse's poetry and his life as energy with which to nourish himself. He used this to encourage himself: a person has to go through life's rises and falls before there is a possibility of encountering hope. This drifting and coming together of life, these experiences, made him realize that perhaps his own life was like this too: he needed to go through certain things before he could gain something. But now, through meditation, and all the pausing and stopping, he seemed no longer willing to believe in Siddhartha's set of ideas. Or rather, he was unwilling to accept anyone's answer. He was also unwilling to let the answer inside his heart be persuaded by any story from the outside. In stand-up comedy, someone might talk about quitting their job, taking ten years off without working, and yet still standing on the stage of a comedy show today. Hesse, too, had ultimately returned to peace. Everything, everything seemed to lead toward a positive, peaceful path. The girl was tired of narratives like this. By this time, the girl was nearly forty or fifty. By society's measure, this girl of forty or fifty ought to have been panicking, but she was not. She saw a fish drift past her eyes, a rainbow-colored fish, and then this rainbow-colored fish joined other rainbow-colored fish to form a whole expanse. She saw a pair of very splendid feathers, which then quietly settled onto a pine or cypress branch. Then countless feathers gathered together, settled on this tree, formed an enormous mass, and began to turn, turning like a carousel. The girl began to float with them. She did not know how any of this was happening. She floated to the tree's side and saw eyes growing beside it, thousands upon thousands of eyes, radiating light, and some soft blue wrapping her inside it. She had no idea what was happening with any of this. Then she came to rest in the tree's crown. This was the sago palm she had watched her maternal grandfather plant when she was little. The sago palm kept flowering, until the family moved, until her grandfather died, and the sago palm was gone. But there she was, sitting on that sago palm, looking up at the sky, looking at the very, very biggest cloud. Then she watched for a long time. She saw the buildings of the world begin to melt into color and flow into the river. She watched the little squares of apps on her phone flow out of the screen, turn into smells, turn into colors, and flow into the river too. Now she was sixty years old, but in fact she was only twenty. And this was twenty.</w:t>
       </w:r>
     </w:p>
     <w:sectPr>

</xml_diff>